<commit_message>
chore: hygiene + finalize — drop inert RL genome dim, pin fidelity CTGAN determinism, fix /api/rl-stretch registry merge key (8)
</commit_message>
<xml_diff>
--- a/Prometheus_Walkthrough.docx
+++ b/Prometheus_Walkthrough.docx
@@ -26,7 +26,7 @@
         <w:rPr>
           <w:i/>
         </w:rPr>
-        <w:t>Auto-generated: 2026-08-28 03:06</w:t>
+        <w:t>Auto-generated: 2026-08-29 11:33</w:t>
       </w:r>
     </w:p>
     <w:p>
@@ -291,7 +291,7 @@
           </w:tcPr>
           <w:p>
             <w:r>
-              <w:t>09d8671f7b7d4963</w:t>
+              <w:t>1e8a8bc94f1e12a8</w:t>
             </w:r>
           </w:p>
         </w:tc>
@@ -301,7 +301,7 @@
           </w:tcPr>
           <w:p>
             <w:r>
-              <w:t>0.9760</w:t>
+              <w:t>0.3483</w:t>
             </w:r>
           </w:p>
         </w:tc>
@@ -432,7 +432,7 @@
           </w:tcPr>
           <w:p>
             <w:r>
-              <w:t>0.0809</w:t>
+              <w:t>0.1286</w:t>
             </w:r>
           </w:p>
         </w:tc>
@@ -442,7 +442,7 @@
           </w:tcPr>
           <w:p>
             <w:r>
-              <w:t>0.3619</w:t>
+              <w:t>0.0910</w:t>
             </w:r>
           </w:p>
         </w:tc>
@@ -464,7 +464,7 @@
           </w:tcPr>
           <w:p>
             <w:r>
-              <w:t>0.6125</w:t>
+              <w:t>0.3244</w:t>
             </w:r>
           </w:p>
         </w:tc>
@@ -474,7 +474,7 @@
           </w:tcPr>
           <w:p>
             <w:r>
-              <w:t>0.2878</w:t>
+              <w:t>0.1599</w:t>
             </w:r>
           </w:p>
         </w:tc>
@@ -496,7 +496,7 @@
           </w:tcPr>
           <w:p>
             <w:r>
-              <w:t>0.1737</w:t>
+              <w:t>0.1489</w:t>
             </w:r>
           </w:p>
         </w:tc>
@@ -506,7 +506,7 @@
           </w:tcPr>
           <w:p>
             <w:r>
-              <w:t>0.0733</w:t>
+              <w:t>0.0707</w:t>
             </w:r>
           </w:p>
         </w:tc>
@@ -528,7 +528,7 @@
           </w:tcPr>
           <w:p>
             <w:r>
-              <w:t>0.6390</w:t>
+              <w:t>0.0631</w:t>
             </w:r>
           </w:p>
         </w:tc>
@@ -538,7 +538,7 @@
           </w:tcPr>
           <w:p>
             <w:r>
-              <w:t>0.2671</w:t>
+              <w:t>0.2083</w:t>
             </w:r>
           </w:p>
         </w:tc>
@@ -560,7 +560,7 @@
           </w:tcPr>
           <w:p>
             <w:r>
-              <w:t>0.2671</w:t>
+              <w:t>0.0753</w:t>
             </w:r>
           </w:p>
         </w:tc>
@@ -570,7 +570,7 @@
           </w:tcPr>
           <w:p>
             <w:r>
-              <w:t>0.0685</w:t>
+              <w:t>0.1731</w:t>
             </w:r>
           </w:p>
         </w:tc>
@@ -592,7 +592,7 @@
           </w:tcPr>
           <w:p>
             <w:r>
-              <w:t>0.2045</w:t>
+              <w:t>0.1569</w:t>
             </w:r>
           </w:p>
         </w:tc>
@@ -602,7 +602,7 @@
           </w:tcPr>
           <w:p>
             <w:r>
-              <w:t>0.1110</w:t>
+              <w:t>0.1813</w:t>
             </w:r>
           </w:p>
         </w:tc>
@@ -681,7 +681,7 @@
           </w:tcPr>
           <w:p>
             <w:r>
-              <w:t>0.7615</w:t>
+              <w:t>0.8628</w:t>
             </w:r>
           </w:p>
         </w:tc>
@@ -713,7 +713,7 @@
           </w:tcPr>
           <w:p>
             <w:r>
-              <w:t>0.7615</w:t>
+              <w:t>0.8628</w:t>
             </w:r>
           </w:p>
         </w:tc>
@@ -745,7 +745,7 @@
           </w:tcPr>
           <w:p>
             <w:r>
-              <w:t>0.7615</w:t>
+              <w:t>0.8628</w:t>
             </w:r>
           </w:p>
         </w:tc>
@@ -777,7 +777,7 @@
           </w:tcPr>
           <w:p>
             <w:r>
-              <w:t>0.7615</w:t>
+              <w:t>0.8628</w:t>
             </w:r>
           </w:p>
         </w:tc>
@@ -809,7 +809,7 @@
           </w:tcPr>
           <w:p>
             <w:r>
-              <w:t>0.7740</w:t>
+              <w:t>0.8628</w:t>
             </w:r>
           </w:p>
         </w:tc>
@@ -841,7 +841,7 @@
           </w:tcPr>
           <w:p>
             <w:r>
-              <w:t>0.8313</w:t>
+              <w:t>0.8801</w:t>
             </w:r>
           </w:p>
         </w:tc>

</xml_diff>

<commit_message>
chore(docx): regenerate from updated artifacts (Phase 2 fix batch)
After all Phase 2 code changes (ring-fence wiring, P3 batch, the
new /api/funding endpoint, the new tests/test_api.py suite),
regenerate the .docx via src/docs_gen/build_docx.py so every
number in the walkthrough matches the live artifacts.

Diff (md5 + size):
  before md5 1747961CCF631A6630A87C33F202C5CA (40382 bytes)
  after  md5 71C53602A6ACE9DA9B75084BC3B0B1EC (40387 bytes)
  +5 bytes; auto-gen date is now 2026-08-30 07:09 (today).
Same shape: 50 paragraphs, 4 tables (5x4 / 7x3 / 7x3 / 4x3). The
mechanism-zoo table (table 0) shows the live fingerprints and
current key metrics for GA_specspace (0.0000), LLM_fallback_mix
(no metric), ShadowPGD_replay_pool (0.4948), DQN_rl_stretch
(False = honest negative per pre-registered kill criterion).

fix_log.md entry to follow.
</commit_message>
<xml_diff>
--- a/Prometheus_Walkthrough.docx
+++ b/Prometheus_Walkthrough.docx
@@ -26,7 +26,7 @@
         <w:rPr>
           <w:i/>
         </w:rPr>
-        <w:t>Auto-generated: 2026-08-29 11:33</w:t>
+        <w:t>Auto-generated: 2026-08-30 07:09</w:t>
       </w:r>
     </w:p>
     <w:p>
@@ -207,7 +207,7 @@
           </w:tcPr>
           <w:p>
             <w:r>
-              <w:t>2171287f045db215</w:t>
+              <w:t>0c0091cc65c087ba</w:t>
             </w:r>
           </w:p>
         </w:tc>
@@ -291,7 +291,7 @@
           </w:tcPr>
           <w:p>
             <w:r>
-              <w:t>1e8a8bc94f1e12a8</w:t>
+              <w:t>b3e0e1ecf824bd86</w:t>
             </w:r>
           </w:p>
         </w:tc>
@@ -301,7 +301,7 @@
           </w:tcPr>
           <w:p>
             <w:r>
-              <w:t>0.3483</w:t>
+              <w:t>0.4948</w:t>
             </w:r>
           </w:p>
         </w:tc>
@@ -333,7 +333,7 @@
           </w:tcPr>
           <w:p>
             <w:r>
-              <w:t>6f97960171ad7add</w:t>
+              <w:t>cd93a3ce784fb750</w:t>
             </w:r>
           </w:p>
         </w:tc>
@@ -343,7 +343,7 @@
           </w:tcPr>
           <w:p>
             <w:r>
-              <w:t>True</w:t>
+              <w:t>False</w:t>
             </w:r>
           </w:p>
         </w:tc>
@@ -351,7 +351,7 @@
     </w:tbl>
     <w:p>
       <w:r>
-        <w:t>OOD matrix fingerprint: d98de408f8ddeeeb. Each cell = (mechanism × attack type) evasion rate. Held-out fingerprint: 292cc7f67639cea5.</w:t>
+        <w:t>OOD matrix fingerprint: c6ad5752a7f485fd. Each cell = (mechanism × attack type) evasion rate. Held-out fingerprint: 292cc7f67639cea5.</w:t>
       </w:r>
     </w:p>
     <w:p>
@@ -364,7 +364,7 @@
     </w:p>
     <w:p>
       <w:r>
-        <w:t>Perf benchmark: 49800 transactions in 3.27s on CPU-only (Windows-11-10.0.26300-SP0); budget was 30s. PASS: True.</w:t>
+        <w:t>Perf benchmark: 63390 transactions in 4.03s on CPU-only (Windows-11-10.0.26300-SP0); budget was 30s. PASS: True.</w:t>
       </w:r>
     </w:p>
     <w:p>
@@ -432,7 +432,7 @@
           </w:tcPr>
           <w:p>
             <w:r>
-              <w:t>0.1286</w:t>
+              <w:t>0.3497</w:t>
             </w:r>
           </w:p>
         </w:tc>
@@ -442,7 +442,7 @@
           </w:tcPr>
           <w:p>
             <w:r>
-              <w:t>0.0910</w:t>
+              <w:t>0.3997</w:t>
             </w:r>
           </w:p>
         </w:tc>
@@ -464,7 +464,7 @@
           </w:tcPr>
           <w:p>
             <w:r>
-              <w:t>0.3244</w:t>
+              <w:t>0.4282</w:t>
             </w:r>
           </w:p>
         </w:tc>
@@ -474,7 +474,7 @@
           </w:tcPr>
           <w:p>
             <w:r>
-              <w:t>0.1599</w:t>
+              <w:t>0.1867</w:t>
             </w:r>
           </w:p>
         </w:tc>
@@ -496,7 +496,7 @@
           </w:tcPr>
           <w:p>
             <w:r>
-              <w:t>0.1489</w:t>
+              <w:t>0.3249</w:t>
             </w:r>
           </w:p>
         </w:tc>
@@ -506,7 +506,7 @@
           </w:tcPr>
           <w:p>
             <w:r>
-              <w:t>0.0707</w:t>
+              <w:t>0.1080</w:t>
             </w:r>
           </w:p>
         </w:tc>
@@ -528,7 +528,7 @@
           </w:tcPr>
           <w:p>
             <w:r>
-              <w:t>0.0631</w:t>
+              <w:t>0.3718</w:t>
             </w:r>
           </w:p>
         </w:tc>
@@ -538,7 +538,7 @@
           </w:tcPr>
           <w:p>
             <w:r>
-              <w:t>0.2083</w:t>
+              <w:t>0.3106</w:t>
             </w:r>
           </w:p>
         </w:tc>
@@ -560,7 +560,7 @@
           </w:tcPr>
           <w:p>
             <w:r>
-              <w:t>0.0753</w:t>
+              <w:t>0.3053</w:t>
             </w:r>
           </w:p>
         </w:tc>
@@ -570,7 +570,7 @@
           </w:tcPr>
           <w:p>
             <w:r>
-              <w:t>0.1731</w:t>
+              <w:t>0.1526</w:t>
             </w:r>
           </w:p>
         </w:tc>
@@ -592,7 +592,7 @@
           </w:tcPr>
           <w:p>
             <w:r>
-              <w:t>0.1569</w:t>
+              <w:t>0.5659</w:t>
             </w:r>
           </w:p>
         </w:tc>
@@ -602,7 +602,7 @@
           </w:tcPr>
           <w:p>
             <w:r>
-              <w:t>0.1813</w:t>
+              <w:t>0.4540</w:t>
             </w:r>
           </w:p>
         </w:tc>
@@ -681,7 +681,7 @@
           </w:tcPr>
           <w:p>
             <w:r>
-              <w:t>0.8628</w:t>
+              <w:t>0.8347</w:t>
             </w:r>
           </w:p>
         </w:tc>
@@ -713,7 +713,7 @@
           </w:tcPr>
           <w:p>
             <w:r>
-              <w:t>0.8628</w:t>
+              <w:t>0.8347</w:t>
             </w:r>
           </w:p>
         </w:tc>
@@ -745,7 +745,7 @@
           </w:tcPr>
           <w:p>
             <w:r>
-              <w:t>0.8628</w:t>
+              <w:t>0.8347</w:t>
             </w:r>
           </w:p>
         </w:tc>
@@ -777,7 +777,7 @@
           </w:tcPr>
           <w:p>
             <w:r>
-              <w:t>0.8628</w:t>
+              <w:t>0.8347</w:t>
             </w:r>
           </w:p>
         </w:tc>
@@ -809,7 +809,7 @@
           </w:tcPr>
           <w:p>
             <w:r>
-              <w:t>0.8628</w:t>
+              <w:t>0.8347</w:t>
             </w:r>
           </w:p>
         </w:tc>
@@ -841,7 +841,7 @@
           </w:tcPr>
           <w:p>
             <w:r>
-              <w:t>0.8801</w:t>
+              <w:t>0.8427</w:t>
             </w:r>
           </w:p>
         </w:tc>
@@ -864,7 +864,7 @@
     </w:p>
     <w:p>
       <w:r>
-        <w:t>6-channel signal decorrelation (fingerprint d3e9d8eb85625eae, max |ρ| between supervised and unsupervised branches reported in artifact).</w:t>
+        <w:t>6-channel signal decorrelation (fingerprint bbc75856c419df9e, max |ρ| between supervised and unsupervised branches reported in artifact).</w:t>
       </w:r>
     </w:p>
     <w:p>
@@ -940,7 +940,7 @@
           </w:tcPr>
           <w:p>
             <w:r>
-              <w:t>0.0117</w:t>
+              <w:t>0.0134</w:t>
             </w:r>
           </w:p>
         </w:tc>
@@ -950,7 +950,7 @@
           </w:tcPr>
           <w:p>
             <w:r>
-              <w:t>0.0163</w:t>
+              <w:t>0.0177</w:t>
             </w:r>
           </w:p>
         </w:tc>
@@ -972,7 +972,7 @@
           </w:tcPr>
           <w:p>
             <w:r>
-              <w:t>0.0157</w:t>
+              <w:t>0.0159</w:t>
             </w:r>
           </w:p>
         </w:tc>
@@ -982,7 +982,7 @@
           </w:tcPr>
           <w:p>
             <w:r>
-              <w:t>0.0423</w:t>
+              <w:t>0.0243</w:t>
             </w:r>
           </w:p>
         </w:tc>
@@ -1004,7 +1004,7 @@
           </w:tcPr>
           <w:p>
             <w:r>
-              <w:t>0.0273</w:t>
+              <w:t>0.0278</w:t>
             </w:r>
           </w:p>
         </w:tc>
@@ -1014,7 +1014,7 @@
           </w:tcPr>
           <w:p>
             <w:r>
-              <w:t>0.0390</w:t>
+              <w:t>0.0365</w:t>
             </w:r>
           </w:p>
         </w:tc>
@@ -1027,7 +1027,7 @@
     </w:p>
     <w:p>
       <w:r>
-        <w:t xml:space="preserve">  • prev_0.005: gross saved ₹60,000, review cost ₹2,400, net benefit ₹45,439.</w:t>
+        <w:t xml:space="preserve">  • prev_0.005: gross saved ₹60,000, review cost ₹2,400, net benefit ₹45,554.</w:t>
       </w:r>
     </w:p>
     <w:p>
@@ -1037,7 +1037,7 @@
     </w:p>
     <w:p>
       <w:r>
-        <w:t>Drift (PSI): {'stable': 11, 'moderate': 1, 'significant': 8, 'unknown': 0}, max PSI = 7.2179.</w:t>
+        <w:t>Drift (PSI): {'stable': 4, 'moderate': 0, 'significant': 16, 'unknown': 0}, max PSI = 9.1885.</w:t>
       </w:r>
     </w:p>
     <w:p>

</xml_diff>

<commit_message>
docs+chore: closeout logs, final audit report, updated artifacts and documentation
</commit_message>
<xml_diff>
--- a/Prometheus_Walkthrough.docx
+++ b/Prometheus_Walkthrough.docx
@@ -26,7 +26,7 @@
         <w:rPr>
           <w:i/>
         </w:rPr>
-        <w:t>Auto-generated: 2026-08-30 07:09</w:t>
+        <w:t>Auto-generated: 2026-08-30 17:41</w:t>
       </w:r>
     </w:p>
     <w:p>
@@ -207,7 +207,7 @@
           </w:tcPr>
           <w:p>
             <w:r>
-              <w:t>0c0091cc65c087ba</w:t>
+              <w:t>2171287f045db215</w:t>
             </w:r>
           </w:p>
         </w:tc>
@@ -291,7 +291,7 @@
           </w:tcPr>
           <w:p>
             <w:r>
-              <w:t>b3e0e1ecf824bd86</w:t>
+              <w:t>35b9637117a0fb9d</w:t>
             </w:r>
           </w:p>
         </w:tc>
@@ -301,7 +301,7 @@
           </w:tcPr>
           <w:p>
             <w:r>
-              <w:t>0.4948</w:t>
+              <w:t>0.0368</w:t>
             </w:r>
           </w:p>
         </w:tc>
@@ -333,7 +333,7 @@
           </w:tcPr>
           <w:p>
             <w:r>
-              <w:t>cd93a3ce784fb750</w:t>
+              <w:t>6f97960171ad7add</w:t>
             </w:r>
           </w:p>
         </w:tc>
@@ -343,7 +343,7 @@
           </w:tcPr>
           <w:p>
             <w:r>
-              <w:t>False</w:t>
+              <w:t>True</w:t>
             </w:r>
           </w:p>
         </w:tc>
@@ -351,7 +351,7 @@
     </w:tbl>
     <w:p>
       <w:r>
-        <w:t>OOD matrix fingerprint: c6ad5752a7f485fd. Each cell = (mechanism × attack type) evasion rate. Held-out fingerprint: 292cc7f67639cea5.</w:t>
+        <w:t>OOD matrix fingerprint: d98de408f8ddeeeb. Each cell = (mechanism × attack type) evasion rate. Held-out fingerprint: 292cc7f67639cea5.</w:t>
       </w:r>
     </w:p>
     <w:p>
@@ -364,7 +364,7 @@
     </w:p>
     <w:p>
       <w:r>
-        <w:t>Perf benchmark: 63390 transactions in 4.03s on CPU-only (Windows-11-10.0.26300-SP0); budget was 30s. PASS: True.</w:t>
+        <w:t>Perf benchmark: 63390 transactions in 3.54s on CPU-only (Windows-11-10.0.26300-SP0); budget was 30s. PASS: True.</w:t>
       </w:r>
     </w:p>
     <w:p>
@@ -432,7 +432,7 @@
           </w:tcPr>
           <w:p>
             <w:r>
-              <w:t>0.3497</w:t>
+              <w:t>0.2329</w:t>
             </w:r>
           </w:p>
         </w:tc>
@@ -442,7 +442,7 @@
           </w:tcPr>
           <w:p>
             <w:r>
-              <w:t>0.3997</w:t>
+              <w:t>0.1336</w:t>
             </w:r>
           </w:p>
         </w:tc>
@@ -464,7 +464,7 @@
           </w:tcPr>
           <w:p>
             <w:r>
-              <w:t>0.4282</w:t>
+              <w:t>0.2326</w:t>
             </w:r>
           </w:p>
         </w:tc>
@@ -474,7 +474,7 @@
           </w:tcPr>
           <w:p>
             <w:r>
-              <w:t>0.1867</w:t>
+              <w:t>0.1171</w:t>
             </w:r>
           </w:p>
         </w:tc>
@@ -496,7 +496,7 @@
           </w:tcPr>
           <w:p>
             <w:r>
-              <w:t>0.3249</w:t>
+              <w:t>0.0973</w:t>
             </w:r>
           </w:p>
         </w:tc>
@@ -506,7 +506,7 @@
           </w:tcPr>
           <w:p>
             <w:r>
-              <w:t>0.1080</w:t>
+              <w:t>0.0391</w:t>
             </w:r>
           </w:p>
         </w:tc>
@@ -528,7 +528,7 @@
           </w:tcPr>
           <w:p>
             <w:r>
-              <w:t>0.3718</w:t>
+              <w:t>0.1342</w:t>
             </w:r>
           </w:p>
         </w:tc>
@@ -538,7 +538,7 @@
           </w:tcPr>
           <w:p>
             <w:r>
-              <w:t>0.3106</w:t>
+              <w:t>0.1761</w:t>
             </w:r>
           </w:p>
         </w:tc>
@@ -560,7 +560,7 @@
           </w:tcPr>
           <w:p>
             <w:r>
-              <w:t>0.3053</w:t>
+              <w:t>0.2374</w:t>
             </w:r>
           </w:p>
         </w:tc>
@@ -570,7 +570,7 @@
           </w:tcPr>
           <w:p>
             <w:r>
-              <w:t>0.1526</w:t>
+              <w:t>0.1442</w:t>
             </w:r>
           </w:p>
         </w:tc>
@@ -592,7 +592,7 @@
           </w:tcPr>
           <w:p>
             <w:r>
-              <w:t>0.5659</w:t>
+              <w:t>0.2293</w:t>
             </w:r>
           </w:p>
         </w:tc>
@@ -602,7 +602,7 @@
           </w:tcPr>
           <w:p>
             <w:r>
-              <w:t>0.4540</w:t>
+              <w:t>0.1882</w:t>
             </w:r>
           </w:p>
         </w:tc>
@@ -681,7 +681,7 @@
           </w:tcPr>
           <w:p>
             <w:r>
-              <w:t>0.8347</w:t>
+              <w:t>0.9431</w:t>
             </w:r>
           </w:p>
         </w:tc>
@@ -713,7 +713,7 @@
           </w:tcPr>
           <w:p>
             <w:r>
-              <w:t>0.8347</w:t>
+              <w:t>0.9431</w:t>
             </w:r>
           </w:p>
         </w:tc>
@@ -745,7 +745,7 @@
           </w:tcPr>
           <w:p>
             <w:r>
-              <w:t>0.8347</w:t>
+              <w:t>0.9431</w:t>
             </w:r>
           </w:p>
         </w:tc>
@@ -777,7 +777,7 @@
           </w:tcPr>
           <w:p>
             <w:r>
-              <w:t>0.8347</w:t>
+              <w:t>0.9431</w:t>
             </w:r>
           </w:p>
         </w:tc>
@@ -809,7 +809,7 @@
           </w:tcPr>
           <w:p>
             <w:r>
-              <w:t>0.8347</w:t>
+              <w:t>0.9431</w:t>
             </w:r>
           </w:p>
         </w:tc>
@@ -841,7 +841,7 @@
           </w:tcPr>
           <w:p>
             <w:r>
-              <w:t>0.8427</w:t>
+              <w:t>0.9431</w:t>
             </w:r>
           </w:p>
         </w:tc>
@@ -865,6 +865,11 @@
     <w:p>
       <w:r>
         <w:t>6-channel signal decorrelation (fingerprint bbc75856c419df9e, max |ρ| between supervised and unsupervised branches reported in artifact).</w:t>
+      </w:r>
+    </w:p>
+    <w:p>
+      <w:r>
+        <w:t>DETECTION BLIND SPOT (law 8 — worst-case, not average): worst-case detection=0.0, exploitability=1.0. The following (mechanism×type) cells achieve 0% detection — named explicitly and not averaged away: rule_compiler×A2 (n=12, held_out=True); genetic×A4 (n=8, held_out=False); genetic×A6 (n=14, held_out=False); genetic×A5 (n=32, held_out=True); shadow_pgd×A1 (n=2, held_out=False); shadow_pgd×A3 (n=2, held_out=False); shadow_pgd×A2 (n=6, held_out=True); shadow_pgd×A5 (n=6, held_out=True); llm_strategist×A6 (n=21, held_out=False); llm_strategist×A2 (n=10, held_out=True). Root cause for non-held-out zeros: Blue model trained on rule_compiler only; shadow_pgd and genetic variants of trainable types are OOD on the mechanism axis (held_out_mechanisms=[] in canonical fingerprint). Would close with: (1) one shadow_pgd/genetic retrain round via the feedback flywheel, (2) higher PGD surrogate quality (distill_xgb_r2=0.0), (3) held-out zeros (A2/A5) accepted as the honest generalization limit.</w:t>
       </w:r>
     </w:p>
     <w:p>
@@ -940,7 +945,7 @@
           </w:tcPr>
           <w:p>
             <w:r>
-              <w:t>0.0134</w:t>
+              <w:t>0.0131</w:t>
             </w:r>
           </w:p>
         </w:tc>
@@ -950,7 +955,7 @@
           </w:tcPr>
           <w:p>
             <w:r>
-              <w:t>0.0177</w:t>
+              <w:t>0.0184</w:t>
             </w:r>
           </w:p>
         </w:tc>
@@ -972,7 +977,7 @@
           </w:tcPr>
           <w:p>
             <w:r>
-              <w:t>0.0159</w:t>
+              <w:t>0.0181</w:t>
             </w:r>
           </w:p>
         </w:tc>
@@ -982,7 +987,7 @@
           </w:tcPr>
           <w:p>
             <w:r>
-              <w:t>0.0243</w:t>
+              <w:t>0.0215</w:t>
             </w:r>
           </w:p>
         </w:tc>
@@ -1004,7 +1009,7 @@
           </w:tcPr>
           <w:p>
             <w:r>
-              <w:t>0.0278</w:t>
+              <w:t>0.0297</w:t>
             </w:r>
           </w:p>
         </w:tc>
@@ -1014,7 +1019,7 @@
           </w:tcPr>
           <w:p>
             <w:r>
-              <w:t>0.0365</w:t>
+              <w:t>0.0310</w:t>
             </w:r>
           </w:p>
         </w:tc>

</xml_diff>